<commit_message>
Rising Sun: first prototype sheet, numbering fixed
Co-Authored-By: Claude Sonnet 5.5 <noreply@anthropic.com>
Claude-Session: https://claude.ai/code/session_01HHRsqL7L57Qm5aUfHKQdYK
</commit_message>
<xml_diff>
--- a/rising-sun/Rising-Sun_First-Prototype_2026-10-18.docx
+++ b/rising-sun/Rising-Sun_First-Prototype_2026-10-18.docx
@@ -151,7 +151,7 @@
         <w:ind w:left="432" w:hanging="360"/>
       </w:pPr>
       <w:r>
-        <w:t>5. In the Arduino IDE: Tools, Board, "ESP32S3 Dev Module". The other menu settings are listed at the top of halo_buttons.ino (in good-company/box-buttons). The USB mode setting there is for the buttons and does not matter here.</w:t>
+        <w:t>1. In the Arduino IDE: Tools, Board, "ESP32S3 Dev Module". The other menu settings are listed at the top of halo_buttons.ino (in good-company/box-buttons). The USB mode setting there is for the buttons and does not matter here.</w:t>
       </w:r>
     </w:p>
     <w:p>
@@ -159,7 +159,7 @@
         <w:ind w:left="432" w:hanging="360"/>
       </w:pPr>
       <w:r>
-        <w:t>6. Library Manager: install "Adafruit NeoPixel" and "ArduinoJson" (version 7). The program needs both even in demo mode, because it is one file.</w:t>
+        <w:t>2. Library Manager: install "Adafruit NeoPixel" and "ArduinoJson" (version 7). The program needs both even in demo mode, because it is one file.</w:t>
       </w:r>
     </w:p>
     <w:p>
@@ -167,7 +167,7 @@
         <w:ind w:left="432" w:hanging="360"/>
       </w:pPr>
       <w:r>
-        <w:t>7. Open rising-sun/sunrise.ino. Set LED_COUNT to how many LEDs the strip has.</w:t>
+        <w:t>3. Open rising-sun/sunrise.ino. Set LED_COUNT to how many LEDs the strip has.</w:t>
       </w:r>
     </w:p>
     <w:p>
@@ -175,7 +175,7 @@
         <w:ind w:left="432" w:hanging="360"/>
       </w:pPr>
       <w:r>
-        <w:t>8. Leave DEMO_MODE true. Upload.</w:t>
+        <w:t>4. Leave DEMO_MODE true. Upload.</w:t>
       </w:r>
     </w:p>
     <w:p>

</xml_diff>